<commit_message>
Add HTML version of the experiment report (and rebuild docx with standard heading styles)
Co-Authored-By: Claude Sonnet 5.5 <noreply@anthropic.com>
Claude-Session: https://claude.ai/code/session_01EJj8L3J8PD5D3Auiw9Eorz
</commit_message>
<xml_diff>
--- a/docs/EXPERIMENT_REPORT.docx
+++ b/docs/EXPERIMENT_REPORT.docx
@@ -12225,10 +12225,16 @@
     <w:basedOn w:val="Normal"/>
     <w:next w:val="Normal"/>
     <w:qFormat/>
+    <w:pPr>
+      <w:spacing w:after="200" w:before="240"/>
+    </w:pPr>
     <w:rPr>
-      <w:color w:val="2E74B5"/>
-      <w:sz w:val="32"/>
-      <w:szCs w:val="32"/>
+      <w:rFonts w:ascii="Arial" w:cs="Arial" w:eastAsia="Arial" w:hAnsi="Arial"/>
+      <w:b/>
+      <w:bCs/>
+      <w:color w:val="1F3A5F"/>
+      <w:sz w:val="34"/>
+      <w:szCs w:val="34"/>
     </w:rPr>
   </w:style>
   <w:style w:type="paragraph" w:styleId="Heading2">
@@ -12236,8 +12242,14 @@
     <w:basedOn w:val="Normal"/>
     <w:next w:val="Normal"/>
     <w:qFormat/>
+    <w:pPr>
+      <w:spacing w:after="120" w:before="320"/>
+    </w:pPr>
     <w:rPr>
-      <w:color w:val="2E74B5"/>
+      <w:rFonts w:ascii="Arial" w:cs="Arial" w:eastAsia="Arial" w:hAnsi="Arial"/>
+      <w:b/>
+      <w:bCs/>
+      <w:color w:val="1F3A5F"/>
       <w:sz w:val="26"/>
       <w:szCs w:val="26"/>
     </w:rPr>
@@ -12247,10 +12259,16 @@
     <w:basedOn w:val="Normal"/>
     <w:next w:val="Normal"/>
     <w:qFormat/>
+    <w:pPr>
+      <w:spacing w:after="100" w:before="200"/>
+    </w:pPr>
     <w:rPr>
-      <w:color w:val="1F4D78"/>
-      <w:sz w:val="24"/>
-      <w:szCs w:val="24"/>
+      <w:rFonts w:ascii="Arial" w:cs="Arial" w:eastAsia="Arial" w:hAnsi="Arial"/>
+      <w:b/>
+      <w:bCs/>
+      <w:color w:val="333333"/>
+      <w:sz w:val="22"/>
+      <w:szCs w:val="22"/>
     </w:rPr>
   </w:style>
   <w:style w:type="paragraph" w:styleId="Heading4">
@@ -12381,59 +12399,5 @@
       <w:szCs w:val="20"/>
     </w:rPr>
   </w:style>
-  <w:style w:type="paragraph" w:styleId="Heading1">
-    <w:name w:val="Heading 1"/>
-    <w:basedOn w:val="Normal"/>
-    <w:next w:val="Normal"/>
-    <w:qFormat/>
-    <w:pPr>
-      <w:spacing w:after="200" w:before="240"/>
-      <w:outlineLvl w:val="0"/>
-    </w:pPr>
-    <w:rPr>
-      <w:rFonts w:ascii="Arial" w:cs="Arial" w:eastAsia="Arial" w:hAnsi="Arial"/>
-      <w:b/>
-      <w:bCs/>
-      <w:color w:val="1F3A5F"/>
-      <w:sz w:val="34"/>
-      <w:szCs w:val="34"/>
-    </w:rPr>
-  </w:style>
-  <w:style w:type="paragraph" w:styleId="Heading2">
-    <w:name w:val="Heading 2"/>
-    <w:basedOn w:val="Normal"/>
-    <w:next w:val="Normal"/>
-    <w:qFormat/>
-    <w:pPr>
-      <w:spacing w:after="120" w:before="320"/>
-      <w:outlineLvl w:val="1"/>
-    </w:pPr>
-    <w:rPr>
-      <w:rFonts w:ascii="Arial" w:cs="Arial" w:eastAsia="Arial" w:hAnsi="Arial"/>
-      <w:b/>
-      <w:bCs/>
-      <w:color w:val="1F3A5F"/>
-      <w:sz w:val="26"/>
-      <w:szCs w:val="26"/>
-    </w:rPr>
-  </w:style>
-  <w:style w:type="paragraph" w:styleId="Heading3">
-    <w:name w:val="Heading 3"/>
-    <w:basedOn w:val="Normal"/>
-    <w:next w:val="Normal"/>
-    <w:qFormat/>
-    <w:pPr>
-      <w:spacing w:after="100" w:before="200"/>
-      <w:outlineLvl w:val="2"/>
-    </w:pPr>
-    <w:rPr>
-      <w:rFonts w:ascii="Arial" w:cs="Arial" w:eastAsia="Arial" w:hAnsi="Arial"/>
-      <w:b/>
-      <w:bCs/>
-      <w:color w:val="333333"/>
-      <w:sz w:val="22"/>
-      <w:szCs w:val="22"/>
-    </w:rPr>
-  </w:style>
 </w:styles>
 </file>
</xml_diff>